<commit_message>
docs(report): correct current status labels and update date
</commit_message>
<xml_diff>
--- a/proposal/Progress_Reports/Nhom8_BaoCao_CNPMNC.docx
+++ b/proposal/Progress_Reports/Nhom8_BaoCao_CNPMNC.docx
@@ -9757,17 +9757,8 @@
             <w:vAlign w:val="center"/>
           </w:tcPr>
           <w:p>
-            <w:pPr>
-              <w:spacing w:before="0" w:after="0" w:line="264" w:lineRule="auto"/>
-              <w:jc w:val="left"/>
-            </w:pPr>
-            <w:r>
-              <w:rPr>
-                <w:rFonts w:ascii="Times New Roman" w:hAnsi="Times New Roman" w:eastAsia="Times New Roman" w:cs="Times New Roman"/>
-                <w:sz w:val="22"/>
-                <w:szCs w:val="22"/>
-              </w:rPr>
-              <w:t>US-21 – Sprint 3</w:t>
+            <w:r>
+              <w:t>US-21 – Done sớm 28/10</w:t>
             </w:r>
           </w:p>
         </w:tc>
@@ -11297,12 +11288,7 @@
         <w:jc w:val="both"/>
       </w:pPr>
       <w:r>
-        <w:rPr>
-          <w:rFonts w:ascii="Times New Roman" w:hAnsi="Times New Roman" w:eastAsia="Times New Roman" w:cs="Times New Roman"/>
-          <w:sz w:val="26"/>
-          <w:szCs w:val="26"/>
-        </w:rPr>
-        <w:t>Product Backlog chính thức gồm 30 user story, tổng 121 story point, chia theo năm nhóm tác nhân. Điểm được ước lượng theo thang Fibonacci (2, 3, 5, 8). Story US-27 đến US-30 biến các yêu cầu bắt buộc của Case Study (nhiều buổi/đối tượng, API dùng chung, Web và Mobile) thành story có điểm. Trạng thái dưới đây cập nhật ngày 27/10/2026.</w:t>
+        <w:t>Product Backlog chính thức gồm 30 user story, tổng 121 story point, chia theo năm nhóm tác nhân. Điểm được ước lượng theo thang Fibonacci (2, 3, 5, 8). Story US-27 đến US-30 biến các yêu cầu bắt buộc của Case Study (nhiều buổi/đối tượng, API dùng chung, Web và Mobile) thành story có điểm. Trạng thái dưới đây cập nhật ngày 29/10/2026.</w:t>
       </w:r>
     </w:p>
     <w:p>
@@ -28597,14 +28583,7 @@
         <w:spacing w:before="240" w:after="0"/>
       </w:pPr>
       <w:r>
-        <w:rPr>
-          <w:rFonts w:ascii="Times New Roman" w:hAnsi="Times New Roman" w:eastAsia="Times New Roman" w:cs="Times New Roman"/>
-          <w:i/>
-          <w:iCs/>
-          <w:sz w:val="22"/>
-          <w:szCs w:val="22"/>
-        </w:rPr>
-        <w:t>Cập nhật lần cuối: 27/10/2026. Mã nguồn: https://github.com/BondPhuPhamzZ/Nhom8_HeThongQuanLyHoatDongTinhDRL</w:t>
+        <w:t>Cập nhật lần cuối: 29/10/2026. Mã nguồn: https://github.com/BondPhuPhamzZ/Nhom8_HeThongQuanLyHoatDongTinhDRL</w:t>
       </w:r>
     </w:p>
     <w:sectPr>

</xml_diff>